<commit_message>
Publica template Americana por Marcos
</commit_message>
<xml_diff>
--- a/templates/americana.docx
+++ b/templates/americana.docx
@@ -41,7 +41,7 @@
           <w:b w:val="0"/>
           <w:sz w:val="20"/>
         </w:rPr>
-        <w:t>SINDICATO DOS TRABALHADORES NO COMÉRCIO HOTELEIRO, BARES, RESTAURANTES, HOTÉIS, MOTÉIS, LANCHONETES, APART-HOTÉIS E FAST-FOOD DE PIRACICАВА Е REGIÃO.</w:t>
+        <w:t>SINDICATO DOS EMPREGADOS NO COMERCIO HOTELEIRO E SIMILARES DE AMERICANA E REGIÃO</w:t>
       </w:r>
     </w:p>
     <w:p>
@@ -55,7 +55,7 @@
           <w:b w:val="0"/>
           <w:sz w:val="20"/>
         </w:rPr>
-        <w:t>e</w:t>
+        <w:t>E</w:t>
       </w:r>
     </w:p>
     <w:p>
@@ -69,7 +69,7 @@
           <w:b w:val="0"/>
           <w:sz w:val="20"/>
         </w:rPr>
-        <w:t xml:space="preserve">SINDICATO DOS HOTÉIS, RESTAURANTES, BARES E SIMILARES DE CAMPINAS. </w:t>
+        <w:t xml:space="preserve">SINDICATO DE HOTÉIS, RESTAURANTES, BARES E SIMILARES DE PIRACICABA E REGIÃO - SINHORES PIRACICABA </w:t>
       </w:r>
     </w:p>
     <w:p>
@@ -90,7 +90,23 @@
           <w:b w:val="0"/>
           <w:sz w:val="20"/>
         </w:rPr>
-        <w:t xml:space="preserve">Declaramos que a empresa {{EMPRESA}} - {{CNPJ}} fez a ADESAO da Cesta de Beneficios, tendo contratado o </w:t>
+        <w:t xml:space="preserve">Declaramos que a empresa </w:t>
+      </w:r>
+      <w:r>
+        <w:rPr>
+          <w:rFonts w:ascii="Arial" w:hAnsi="Arial" w:eastAsia="Arial" w:cs="Arial"/>
+          <w:b/>
+          <w:sz w:val="20"/>
+        </w:rPr>
+        <w:t>{{EMPRESA}} - {{CNPJ}}</w:t>
+      </w:r>
+      <w:r>
+        <w:rPr>
+          <w:rFonts w:ascii="Arial" w:hAnsi="Arial" w:eastAsia="Arial" w:cs="Arial"/>
+          <w:b w:val="0"/>
+          <w:sz w:val="20"/>
+        </w:rPr>
+        <w:t xml:space="preserve">, está de acordo com a ATUALIZAÇÃO da CCT de Americana e Região, tendo contrato o </w:t>
       </w:r>
       <w:r>
         <w:rPr>
@@ -106,7 +122,7 @@
           <w:b w:val="0"/>
           <w:sz w:val="20"/>
         </w:rPr>
-        <w:t xml:space="preserve"> os quais atendem na integra a CLAUSULA CESTA DE BENEFICIOS.</w:t>
+        <w:t xml:space="preserve"> os quais atendem na íntegra a CLÁUSULA CESTA DE BENEFÍCIOS. </w:t>
       </w:r>
     </w:p>
     <w:p>
@@ -127,7 +143,7 @@
           <w:b w:val="0"/>
           <w:sz w:val="20"/>
         </w:rPr>
-        <w:t>Informamos que a apolice do Seguro de Vida, bem como o Resumo de fatura do Plano Odontologico e suas respectivas carteirinhas estao em processo de emissao junto a Seguradora. Tao logo estejam disponiveis serao prontamente encaminhadas ao e-mail do nosso estimado cliente.</w:t>
+        <w:t xml:space="preserve">A ATUALIZAÇÃO da apólice foi formalizada mediante o pagamento do boleto pago em {{PAGTO}}. </w:t>
       </w:r>
     </w:p>
     <w:p>
@@ -148,7 +164,7 @@
           <w:b w:val="0"/>
           <w:sz w:val="20"/>
         </w:rPr>
-        <w:t>A ATUALIZACAO da Cesta de Beneficios foi formalizada mediante o pagamento do boleto, realizado em {{PAGTO}}.</w:t>
+        <w:t xml:space="preserve">Informamos que a nova apólice do Seguro de Vida com Telemedicina por vídeo chamada, assim como o Resumo de Fatura do Plano Odontológico e as respectivas carteirinhas estão, atualmente, em processo de emissão junto à Seguradora. Tão logo estejam disponíveis, serão prontamente encaminhados ao e-mail do nosso estimado cliente. </w:t>
       </w:r>
     </w:p>
     <w:p>
@@ -169,7 +185,7 @@
           <w:b w:val="0"/>
           <w:sz w:val="20"/>
         </w:rPr>
-        <w:t>A Cesta de Beneficios esta com estes funcionarios ATIVOS:</w:t>
+        <w:t xml:space="preserve">A Cesta de Benefícios está ativa para os colaboradores abaixo: </w:t>
       </w:r>
     </w:p>
     <w:p>
@@ -204,7 +220,7 @@
           <w:b w:val="0"/>
           <w:sz w:val="20"/>
         </w:rPr>
-        <w:t>Sao Paulo, {{DATA_HOJE}}</w:t>
+        <w:t>São Paulo, {{DATA_HOJE}}</w:t>
       </w:r>
     </w:p>
     <w:p>

</xml_diff>